<commit_message>
docs(protocol-designer): admit RB-005, consolidate P17 and add web architecture
</commit_message>
<xml_diff>
--- a/output/documents/noxia-protocol-designer-reasoning-book-rb-004-cardiac-mri-quantitative-cardiac-imaging.docx
+++ b/output/documents/noxia-protocol-designer-reasoning-book-rb-004-cardiac-mri-quantitative-cardiac-imaging.docx
@@ -184,9 +184,10 @@
           <w:color w:val="667085"/>
           <w:sz w:val="17"/>
         </w:rPr>
-        <w:t>NXP-000002  •  NIVEAU_2  •  VERSION 1.0</w:t>
-        <w:br/>
-        <w:t>État de la preuve arrêté au 3 août 2026</w:t>
+        <w:t>NXP-000002  •  NIVEAU_2  •  </w:t>
+      </w:r>
+      <w:r>
+        <w:t>VERSION 1.1</w:t>
       </w:r>
     </w:p>
     <w:p>
@@ -922,7 +923,7 @@
           <w:b w:val="0"/>
           <w:i w:val="0"/>
         </w:rPr>
-        <w:t xml:space="preserve"> 1.0</w:t>
+        <w:t xml:space="preserve"> 1.1</w:t>
       </w:r>
     </w:p>
     <w:p>
@@ -25491,7 +25492,7 @@
           <w:b w:val="0"/>
           <w:i w:val="0"/>
         </w:rPr>
-        <w:t xml:space="preserve">. 2026. DOI: 10.1016/j.jocmr.2025.101912. PMID: 42241965. PMCID: N/A. </w:t>
+        <w:t xml:space="preserve">. 2026. DOI: 10.1016/j.jocmr.2025.101912. PMID: 42241965. PMCID: PMC13265417. </w:t>
       </w:r>
       <w:hyperlink r:id="rId85">
         <w:r>

</xml_diff>